<commit_message>
Remove em dashes and internal review process language from client doc
Rewrote sentences to drop em dashes in favor of plain punctuation, and
removed references to screenshots/review process so the doc reads
naturally when sent directly to the client.
</commit_message>
<xml_diff>
--- a/assets/stpm-style-redesign/doc/Endurmenntunarferdir-Redesign-Direction.docx
+++ b/assets/stpm-style-redesign/doc/Endurmenntunarferdir-Redesign-Direction.docx
@@ -30,7 +30,7 @@
           <w:sz w:val="34"/>
           <w:szCs w:val="34"/>
         </w:rPr>
-        <w:t xml:space="preserve">Endurmenntunarferðir — restyled in the Smart Teachers Play More visual language</w:t>
+        <w:t xml:space="preserve">Endurmenntunarferðir, restyled in the Smart Teachers Play More visual language</w:t>
       </w:r>
     </w:p>
     <w:p>
@@ -77,7 +77,7 @@
           <w:sz w:val="22"/>
           <w:szCs w:val="22"/>
         </w:rPr>
-        <w:t xml:space="preserve">You asked for the new site to feel like Smart Teachers Play More (STPM). This note reviews STPM's visual language, gives a verdict on each of the sample links you sent against that direction, and lists the concrete ideas worth carrying into the redesign — no page has been built yet, this is just the thinking to agree on first.</w:t>
+        <w:t xml:space="preserve">You asked for the new site to feel like Smart Teachers Play More (STPM). This note reviews STPM's visual language, gives a verdict on each of the sample links you sent against that direction, and lists the concrete ideas worth carrying into the redesign. No page has been built yet, this is just the thinking to agree on first.</w:t>
       </w:r>
     </w:p>
     <w:p>
@@ -109,7 +109,7 @@
           <w:sz w:val="22"/>
           <w:szCs w:val="22"/>
         </w:rPr>
-        <w:t xml:space="preserve">Use STPM as the single style reference. Its look is a soft mint/teal palette against white, cream and pale-green section bands, fully rounded pill buttons, photos cropped into circles, and one confident yellow call-to-action color. None of the sample links matches that warmth closely enough to sit alongside it as a second reference — most would pull the design toward something more corporate or generic. Best approach: keep STPM as the only visual reference, and treat the samples below purely for isolated ideas (a content block, a page rhythm), not for look and feel.</w:t>
+        <w:t xml:space="preserve">Use STPM as the single style reference. Its look is a soft mint/teal palette against white, cream and pale-green section bands, fully rounded pill buttons, photos cropped into circles, and one confident yellow call-to-action color. None of the sample links matches that warmth closely enough to sit alongside it as a second reference, most would pull the design toward something more corporate or generic. Best approach: keep STPM as the only visual reference, and treat the samples below purely for isolated ideas (a content block, a page rhythm), not for look and feel.</w:t>
       </w:r>
     </w:p>
     <w:p>
@@ -141,7 +141,7 @@
           <w:sz w:val="22"/>
           <w:szCs w:val="22"/>
         </w:rPr>
-        <w:t xml:space="preserve">Based on the screenshots you sent through.</w:t>
+        <w:t xml:space="preserve">Here's how each one stacks up against that direction:</w:t>
       </w:r>
     </w:p>
     <w:tbl>
@@ -289,7 +289,7 @@
                 <w:sz w:val="19"/>
                 <w:szCs w:val="19"/>
               </w:rPr>
-              <w:t xml:space="preserve">Same business as yours — Erasmus+ teacher training across European locations, funding help, course dates. Visually dark green/white and fairly institutional, not playful.</w:t>
+              <w:t xml:space="preserve">Same business as yours: Erasmus+ teacher training across European locations, funding help, course dates. Visually dark green/white and fairly institutional, not playful.</w:t>
             </w:r>
           </w:p>
         </w:tc>
@@ -313,7 +313,7 @@
                 <w:sz w:val="19"/>
                 <w:szCs w:val="19"/>
               </w:rPr>
-              <w:t xml:space="preserve">Borrow content ideas only (funding block, locations block) — not the look.</w:t>
+              <w:t xml:space="preserve">Borrow content ideas only (funding block, locations block), not the look.</w:t>
             </w:r>
           </w:p>
         </w:tc>
@@ -443,7 +443,7 @@
                 <w:sz w:val="19"/>
                 <w:szCs w:val="19"/>
               </w:rPr>
-              <w:t xml:space="preserve">Generic university admissions template — navy/red, stats bar, faculty grid. Formal and corporate, opposite tone from STPM's playfulness.</w:t>
+              <w:t xml:space="preserve">Generic university admissions template: navy/red, stats bar, faculty grid. Formal and corporate, opposite tone from STPM's playfulness.</w:t>
             </w:r>
           </w:p>
         </w:tc>
@@ -520,7 +520,7 @@
                 <w:sz w:val="19"/>
                 <w:szCs w:val="19"/>
               </w:rPr>
-              <w:t xml:space="preserve">Nonprofit around play-based learning for kids — blue/purple/pink, big energetic photography, stat highlights. Closest in spirit to STPM's “movement and play” mission, though aimed at children rather than adult teachers.</w:t>
+              <w:t xml:space="preserve">Nonprofit around play-based learning for kids: blue/purple/pink, big energetic photography, stat highlights. Closest in spirit to STPM's “movement and play” mission, though aimed at children rather than adult teachers.</w:t>
             </w:r>
           </w:p>
         </w:tc>
@@ -544,7 +544,7 @@
                 <w:sz w:val="19"/>
                 <w:szCs w:val="19"/>
               </w:rPr>
-              <w:t xml:space="preserve">Closest in tone — useful for photography energy.</w:t>
+              <w:t xml:space="preserve">Closest in tone, useful for photography energy.</w:t>
             </w:r>
           </w:p>
         </w:tc>
@@ -597,7 +597,7 @@
                 <w:sz w:val="19"/>
                 <w:szCs w:val="19"/>
               </w:rPr>
-              <w:t xml:space="preserve">German language school — red/orange, dense and transactional, icon service cards. Doesn't fit the warm, unhurried STPM feel.</w:t>
+              <w:t xml:space="preserve">German language school: red/orange, dense and transactional, icon service cards. Doesn't fit the warm, unhurried STPM feel.</w:t>
             </w:r>
           </w:p>
         </w:tc>
@@ -674,7 +674,7 @@
                 <w:sz w:val="19"/>
                 <w:szCs w:val="19"/>
               </w:rPr>
-              <w:t xml:space="preserve">Generic B2B consultancy template — navy/orange. No meaningful overlap with an education-travel brand.</w:t>
+              <w:t xml:space="preserve">Generic B2B consultancy template: navy/orange. No meaningful overlap with an education-travel brand.</w:t>
             </w:r>
           </w:p>
         </w:tc>
@@ -751,7 +751,7 @@
                 <w:sz w:val="19"/>
                 <w:szCs w:val="19"/>
               </w:rPr>
-              <w:t xml:space="preserve">No screenshot came through for these, so no real verdict — happy to review properly if you send images. By category (food/farm lifestyle brands) they seem an unlikely style match for a teacher-travel site.</w:t>
+              <w:t xml:space="preserve">Not included in this round of review, so no verdict yet. Happy to take a closer look if it's useful. By category (food/farm lifestyle brands) they seem an unlikely style match for a teacher-travel site.</w:t>
             </w:r>
           </w:p>
         </w:tc>
@@ -810,7 +810,7 @@
           <w:sz w:val="22"/>
           <w:szCs w:val="22"/>
         </w:rPr>
-        <w:t xml:space="preserve">What carries over from STPM, applied to your actual content — not a built page yet, just what we'd design toward once you confirm the direction.</w:t>
+        <w:t xml:space="preserve">What carries over from STPM, applied to your actual content. Not a built page yet, just what we'd design toward once you confirm the direction.</w:t>
       </w:r>
     </w:p>
     <w:p>
@@ -849,7 +849,7 @@
           <w:sz w:val="21"/>
           <w:szCs w:val="21"/>
         </w:rPr>
-        <w:t xml:space="preserve">Replace the current bright cyan/orange with a softer teal-on-white system and a single warm gold for buttons — reads calmer and closer to STPM.</w:t>
+        <w:t xml:space="preserve">Replace the current bright cyan/orange with a softer teal-on-white system and a single warm gold for buttons. Reads calmer and closer to STPM.</w:t>
       </w:r>
     </w:p>
     <w:p>
@@ -927,7 +927,7 @@
           <w:sz w:val="21"/>
           <w:szCs w:val="21"/>
         </w:rPr>
-        <w:t xml:space="preserve">STPM opens with a 2×2 country grid plus a pill button under each. Your four destinations — Amsterdam, London, Salzburg, Berlin — map onto that pattern directly.</w:t>
+        <w:t xml:space="preserve">STPM opens with a 2×2 country grid plus a pill button under each. Your four destinations, Amsterdam, London, Salzburg, and Berlin, map onto that pattern directly.</w:t>
       </w:r>
     </w:p>
     <w:p>
@@ -1005,7 +1005,7 @@
           <w:sz w:val="21"/>
           <w:szCs w:val="21"/>
         </w:rPr>
-        <w:t xml:space="preserve">Your Vonarsjóður/Erasmus+ funding info is currently plain text — worth turning into its own bold teal banner, the way STPM promotes its book.</w:t>
+        <w:t xml:space="preserve">Your Vonarsjóður/Erasmus+ funding info is currently plain text, worth turning into its own bold teal banner, the way STPM promotes its book.</w:t>
       </w:r>
     </w:p>
     <w:p>
@@ -1044,7 +1044,7 @@
           <w:sz w:val="21"/>
           <w:szCs w:val="21"/>
         </w:rPr>
-        <w:t xml:space="preserve">New addition, borrowed from STPM's community sign-up band — a simple name/email capture to keep past participants warm for next year's trips.</w:t>
+        <w:t xml:space="preserve">New addition, borrowed from STPM's community sign-up band: a simple name/email capture to keep past participants warm for next year's trips.</w:t>
       </w:r>
     </w:p>
     <w:p>

</xml_diff>